<commit_message>
Paper: evidence tiers, public summary, figure PNGs, PDF refresh
- README: tiered evidence; link README_PAPER_PIPELINE, EVIDENCE_PUBLIC_SUMMARY, PDF formatting
- Add paper-assets PNGs; sync STAMP sources and short pointer docs
- Regenerate STAMP_ARE_Paper.pdf (tables + embedded figures)

Made-with: Cursor
</commit_message>
<xml_diff>
--- a/STAMP_ARE_Paper_arxiv_ready.docx
+++ b/STAMP_ARE_Paper_arxiv_ready.docx
@@ -99,10 +99,10 @@
         <w:rPr>
           <w:b/>
         </w:rPr>
-        <w:t>Submission mechanics</w:t>
-      </w:r>
-      <w:r>
-        <w:t xml:space="preserve"> (arXiv LaTeX vs Markdown, figures, where bundles live): `paper/ARXIV_AND_EVIDENCE_REALITY.md`. *Update commit hash when re-freezing.*</w:t>
+        <w:t>Paper / PDF / evidence hub:</w:t>
+      </w:r>
+      <w:r>
+        <w:t xml:space="preserve"> `paper/README_PAPER_PIPELINE.md` (also `paper/ARXIV_AND_EVIDENCE_REALITY.md`). *Update commit hash when re-freezing.*</w:t>
       </w:r>
     </w:p>
     <w:p>
@@ -721,9 +721,9 @@
       </w:r>
     </w:p>
     <w:p>
-      <w:r>
-        <w:t xml:space="preserve">1. </w:t>
-      </w:r>
+      <w:pPr>
+        <w:pStyle w:val="ListNumber"/>
+      </w:pPr>
       <w:r>
         <w:rPr>
           <w:b/>
@@ -780,9 +780,9 @@
       </w:r>
     </w:p>
     <w:p>
-      <w:r>
-        <w:t xml:space="preserve">2. </w:t>
-      </w:r>
+      <w:pPr>
+        <w:pStyle w:val="ListNumber"/>
+      </w:pPr>
       <w:r>
         <w:rPr>
           <w:b/>
@@ -2512,61 +2512,217 @@
         <w:rPr>
           <w:b/>
         </w:rPr>
-        <w:t>Public narrative (discipline, tenets, PDFs):</w:t>
-      </w:r>
-      <w:r>
-        <w:t xml:space="preserve"> [github.com/srex-dev/AgentResponsibilityEngineering](https://github.com/srex-dev/AgentResponsibilityEngineering).</w:t>
-      </w:r>
-    </w:p>
-    <w:p>
+        <w:t>This is not “full evidence or nothing.”</w:t>
+      </w:r>
+      <w:r>
+        <w:t xml:space="preserve"> There are </w:t>
+      </w:r>
       <w:r>
         <w:rPr>
           <w:b/>
         </w:rPr>
-        <w:t>Research documentation spine (this repository):</w:t>
-      </w:r>
-      <w:r>
-        <w:t xml:space="preserve"> Normative STPA closure and traceability live under `research/stpa/` (index `research/stpa/README.md`): `STPA_PACKAGE.md`, `STPA_RESOLUTION.md`, `UCA_ENUMERATION.md`, `HAZARD_UCA_CONSTRAINT_TEST_CLOSURE.md`, `BOUNDARY_AND_ASSUMPTIONS_STPA.md`, `CAUSAL_SCENARIOS_SYSTEMATIC.md`. Interposition audit: `research/interposition_audit.md`. Claims and reviewer matrix: `research/claims_ledger.md`, `research/reviewer_attacks.md`. Track evidence summaries: `research/track-a-stamp/EVIDENCE_SUMMARY.md`, `research/track-b-interposition/EVIDENCE_SUMMARY.md`; cross-track pointer: `research/DUAL_TRACK_SUMMARY.md`.</w:t>
-      </w:r>
-    </w:p>
-    <w:p>
+        <w:t>three levels</w:t>
+      </w:r>
+      <w:r>
+        <w:t xml:space="preserve"> so public readers are not asked to download megabytes of logs, while reviewers can still escalate to </w:t>
+      </w:r>
       <w:r>
         <w:rPr>
           <w:b/>
         </w:rPr>
-        <w:t>Implementation evidence</w:t>
-      </w:r>
-      <w:r>
-        <w:t xml:space="preserve"> for the claims in §4–§7 is drawn from component and integration tests on the </w:t>
+        <w:t>hashed, replayable</w:t>
+      </w:r>
+      <w:r>
+        <w:t xml:space="preserve"> artifacts.</w:t>
+      </w:r>
+    </w:p>
+    <w:p>
+      <w:pPr>
+        <w:pStyle w:val="Heading1"/>
+      </w:pPr>
+      <w:r>
+        <w:t>13.1 Level 1 — Always public (no NDA, no bundle download)</w:t>
+      </w:r>
+    </w:p>
+    <w:p>
+      <w:pPr>
+        <w:pStyle w:val="ListNumber"/>
+      </w:pPr>
+      <w:r>
+        <w:t xml:space="preserve">This paper (including </w:t>
       </w:r>
       <w:r>
         <w:rPr>
           <w:b/>
         </w:rPr>
-        <w:t>frozen</w:t>
-      </w:r>
-      <w:r>
-        <w:t xml:space="preserve"> configuration captured in the evidence bundle—not as a substitute for deployment certification. Falsifiers include Rust and Go service tests on the golden path; lightweight Python harnesses additionally regress documentation and structure (exact harness layout may be omitted in a redacted public variant).</w:t>
+        <w:t>Appendices A–C</w:t>
+      </w:r>
+      <w:r>
+        <w:t>: roles, hazard table, graphic summary).</w:t>
       </w:r>
     </w:p>
     <w:p>
+      <w:pPr>
+        <w:pStyle w:val="ListNumber"/>
+      </w:pPr>
+      <w:r>
+        <w:t>The public discipline repository (README, tenets, PDFs): [github.com/srex-dev/AgentResponsibilityEngineering](https://github.com/srex-dev/AgentResponsibilityEngineering).</w:t>
+      </w:r>
+    </w:p>
+    <w:p>
+      <w:pPr>
+        <w:pStyle w:val="ListNumber"/>
+      </w:pPr>
       <w:r>
         <w:rPr>
           <w:b/>
         </w:rPr>
-        <w:t>Frozen reviewer packets</w:t>
-      </w:r>
-      <w:r>
-        <w:t xml:space="preserve"> — procedure and layout: `research/evidence-bundles/README.md`. Submission snapshot `research/evidence-bundles/2026-04-26-stamp-safety-reviewer-packet-submission/` copies key research artifacts (`STPA_RESOLUTION.md`, `STPA_PACKAGE.md`, `claims_ledger.md`, `interposition_audit.md`, `SAFETY_CASE.md`, paper pointers), gate logs, `GIT_HEAD.txt` / `GIT_BRANCH.txt`, `MANIFEST.md`, and `FILES.sha256`. </w:t>
+        <w:t>`paper/EVIDENCE_PUBLIC_SUMMARY.md`</w:t>
+      </w:r>
+      <w:r>
+        <w:t xml:space="preserve"> — one-page </w:t>
       </w:r>
       <w:r>
         <w:rPr>
           <w:b/>
         </w:rPr>
-        <w:t>Re-freeze</w:t>
-      </w:r>
-      <w:r>
-        <w:t xml:space="preserve"> for a new submission by re-running `pytest tests/ -q`, `python tools/testing/run-all-internal-gates.py`, and the steps in `research/evidence-bundles/README.md`, then updating the commit hash in this paper’s metadata.</w:t>
+        <w:t>attestation</w:t>
+      </w:r>
+      <w:r>
+        <w:t xml:space="preserve">: what was frozen, which commit, what *classes* of artifact exist (still </w:t>
+      </w:r>
+      <w:r>
+        <w:rPr>
+          <w:b/>
+        </w:rPr>
+        <w:t>not</w:t>
+      </w:r>
+      <w:r>
+        <w:t xml:space="preserve"> raw logs).</w:t>
+      </w:r>
+    </w:p>
+    <w:p>
+      <w:r>
+        <w:rPr>
+          <w:b/>
+        </w:rPr>
+        <w:t>Why the public PDF does not embed the full bundle:</w:t>
+      </w:r>
+      <w:r>
+        <w:t xml:space="preserve"> logs and internal gate matrices expose </w:t>
+      </w:r>
+      <w:r>
+        <w:rPr>
+          <w:b/>
+        </w:rPr>
+        <w:t>integration topology, paths, and operational detail</w:t>
+      </w:r>
+      <w:r>
+        <w:t xml:space="preserve"> we treat as </w:t>
+      </w:r>
+      <w:r>
+        <w:rPr>
+          <w:b/>
+        </w:rPr>
+        <w:t>implementation hygiene / IP</w:t>
+      </w:r>
+      <w:r>
+        <w:t xml:space="preserve">. That is normal for industrial safety cases: the </w:t>
+      </w:r>
+      <w:r>
+        <w:rPr>
+          <w:b/>
+        </w:rPr>
+        <w:t>argument</w:t>
+      </w:r>
+      <w:r>
+        <w:t xml:space="preserve"> is public; the </w:t>
+      </w:r>
+      <w:r>
+        <w:rPr>
+          <w:b/>
+        </w:rPr>
+        <w:t>engineering packet</w:t>
+      </w:r>
+      <w:r>
+        <w:t xml:space="preserve"> is often shared under confidentiality or as supplementary material.</w:t>
+      </w:r>
+    </w:p>
+    <w:p>
+      <w:pPr>
+        <w:pStyle w:val="Heading1"/>
+      </w:pPr>
+      <w:r>
+        <w:t>13.2 Level 2 — Repository research spine (clone the `are` repo)</w:t>
+      </w:r>
+    </w:p>
+    <w:p>
+      <w:r>
+        <w:t>Normative STPA closure and traceability live under `research/stpa/` (index `research/stpa/README.md`): `STPA_PACKAGE.md`, `STPA_RESOLUTION.md`, `UCA_ENUMERATION.md`, `HAZARD_UCA_CONSTRAINT_TEST_CLOSURE.md`, `BOUNDARY_AND_ASSUMPTIONS_STPA.md`, `CAUSAL_SCENARIOS_SYSTEMATIC.md`. Interposition audit: `research/interposition_audit.md`. Claims and reviewer matrix: `research/claims_ledger.md`, `research/reviewer_attacks.md`. Track summaries: `research/track-a-stamp/EVIDENCE_SUMMARY.md`, `research/track-b-interposition/EVIDENCE_SUMMARY.md`; `research/DUAL_TRACK_SUMMARY.md`.</w:t>
+      </w:r>
+    </w:p>
+    <w:p>
+      <w:pPr>
+        <w:pStyle w:val="Heading1"/>
+      </w:pPr>
+      <w:r>
+        <w:t>13.3 Level 3 — Full frozen packet (on request, or ancillary zip)</w:t>
+      </w:r>
+    </w:p>
+    <w:p>
+      <w:r>
+        <w:rPr>
+          <w:b/>
+        </w:rPr>
+        <w:t>Directory:</w:t>
+      </w:r>
+      <w:r>
+        <w:t xml:space="preserve"> `research/evidence-bundles/2026-04-26-stamp-safety-reviewer-packet-submission/` — copies of normative docs, </w:t>
+      </w:r>
+      <w:r>
+        <w:rPr>
+          <w:b/>
+        </w:rPr>
+        <w:t>full</w:t>
+      </w:r>
+      <w:r>
+        <w:t xml:space="preserve"> pytest + internal-gate transcripts, `GIT_HEAD.txt`, `MANIFEST.md`, and </w:t>
+      </w:r>
+      <w:r>
+        <w:rPr>
+          <w:b/>
+        </w:rPr>
+        <w:t>`FILES.sha256`</w:t>
+      </w:r>
+      <w:r>
+        <w:t xml:space="preserve"> for integrity. </w:t>
+      </w:r>
+      <w:r>
+        <w:rPr>
+          <w:b/>
+        </w:rPr>
+        <w:t>Program chairs / reviewers</w:t>
+      </w:r>
+      <w:r>
+        <w:t xml:space="preserve"> may request this zip under confidentiality, or authors may attach it as </w:t>
+      </w:r>
+      <w:r>
+        <w:rPr>
+          <w:b/>
+        </w:rPr>
+        <w:t>arXiv Ancillary</w:t>
+      </w:r>
+      <w:r>
+        <w:t xml:space="preserve"> / journal supplementary. </w:t>
+      </w:r>
+      <w:r>
+        <w:rPr>
+          <w:b/>
+        </w:rPr>
+        <w:t>Assemble</w:t>
+      </w:r>
+      <w:r>
+        <w:t xml:space="preserve"> a portable tree with `python tools/paper/assemble_submission_package.py` (see `paper/submission-package/README.md`).</w:t>
       </w:r>
     </w:p>
     <w:p>
@@ -2577,7 +2733,7 @@
         <w:t>Independent verification without full source:</w:t>
       </w:r>
       <w:r>
-        <w:t xml:space="preserve"> The frozen evidence bundle provides </w:t>
+        <w:t xml:space="preserve"> Level 3 provides </w:t>
       </w:r>
       <w:r>
         <w:rPr>
@@ -2586,45 +2742,44 @@
         <w:t>verifiable artifacts</w:t>
       </w:r>
       <w:r>
-        <w:t xml:space="preserve"> (cryptographic hashes, command transcripts, structured test and gate outputs, and normative STPA closure text) </w:t>
+        <w:t xml:space="preserve"> (hashes, transcripts, structured outputs, normative closure text) </w:t>
       </w:r>
       <w:r>
         <w:rPr>
           <w:b/>
         </w:rPr>
-        <w:t>sufficient for independent inspection of the paper’s evidentiary claims</w:t>
-      </w:r>
-      <w:r>
-        <w:t>, even where the full implementation source is not publicly distributed.</w:t>
-      </w:r>
-    </w:p>
-    <w:p>
+        <w:t>sufficient to inspect the paper’s evidentiary claims</w:t>
+      </w:r>
+      <w:r>
+        <w:t xml:space="preserve">; Level 1–2 still let readers </w:t>
+      </w:r>
       <w:r>
         <w:rPr>
           <w:b/>
         </w:rPr>
-        <w:t>Formal methods:</w:t>
-      </w:r>
-      <w:r>
-        <w:t xml:space="preserve"> `formal/tla/are_execution_boundary.tla` is a </w:t>
+        <w:t>orient</w:t>
+      </w:r>
+      <w:r>
+        <w:t xml:space="preserve"> without that download.</w:t>
+      </w:r>
+    </w:p>
+    <w:p>
+      <w:pPr>
+        <w:pStyle w:val="Heading1"/>
+      </w:pPr>
+      <w:r>
+        <w:t>13.4 Graphic summary (tables + equation-style figures)</w:t>
+      </w:r>
+    </w:p>
+    <w:p>
+      <w:r>
+        <w:t xml:space="preserve">The Word/PDF pipeline embeds raster figures generated from `tools/paper/render_paper_assets.py` (run before `md_to_arxiv_docx.py`). </w:t>
       </w:r>
       <w:r>
         <w:rPr>
           <w:b/>
         </w:rPr>
-        <w:t>TLA+ skeleton</w:t>
-      </w:r>
-      <w:r>
-        <w:t xml:space="preserve"> expressing ordering obligations—it is a </w:t>
-      </w:r>
-      <w:r>
-        <w:rPr>
-          <w:b/>
-        </w:rPr>
-        <w:t>proof target</w:t>
-      </w:r>
-      <w:r>
-        <w:t>, not a TLAPS proof.</w:t>
+        <w:t>Golden path:</w:t>
       </w:r>
     </w:p>
     <w:p>
@@ -2632,6 +2787,196 @@
         <w:jc w:val="center"/>
       </w:pPr>
       <w:r>
+        <w:drawing>
+          <wp:inline xmlns:a="http://schemas.openxmlformats.org/drawingml/2006/main" xmlns:pic="http://schemas.openxmlformats.org/drawingml/2006/picture">
+            <wp:extent cx="5394960" cy="1181886"/>
+            <wp:docPr id="1" name="Picture 1"/>
+            <wp:cNvGraphicFramePr>
+              <a:graphicFrameLocks noChangeAspect="1"/>
+            </wp:cNvGraphicFramePr>
+            <a:graphic>
+              <a:graphicData uri="http://schemas.openxmlformats.org/drawingml/2006/picture">
+                <pic:pic>
+                  <pic:nvPicPr>
+                    <pic:cNvPr id="0" name="fig_golden_path.png"/>
+                    <pic:cNvPicPr/>
+                  </pic:nvPicPr>
+                  <pic:blipFill>
+                    <a:blip r:embed="rId9"/>
+                    <a:stretch>
+                      <a:fillRect/>
+                    </a:stretch>
+                  </pic:blipFill>
+                  <pic:spPr>
+                    <a:xfrm>
+                      <a:off x="0" y="0"/>
+                      <a:ext cx="5394960" cy="1181886"/>
+                    </a:xfrm>
+                    <a:prstGeom prst="rect"/>
+                  </pic:spPr>
+                </pic:pic>
+              </a:graphicData>
+            </a:graphic>
+          </wp:inline>
+        </w:drawing>
+      </w:r>
+    </w:p>
+    <w:p>
+      <w:pPr>
+        <w:jc w:val="center"/>
+      </w:pPr>
+      <w:r>
+        <w:rPr>
+          <w:i/>
+          <w:sz w:val="20"/>
+        </w:rPr>
+        <w:t>Figure 1. Governed execution chain (graphic summary).</w:t>
+      </w:r>
+    </w:p>
+    <w:p>
+      <w:r>
+        <w:rPr>
+          <w:b/>
+        </w:rPr>
+        <w:t>PEV ordering and H6 (Allow+Ledger) invariants (rendered “equation” images):</w:t>
+      </w:r>
+    </w:p>
+    <w:p>
+      <w:pPr>
+        <w:jc w:val="center"/>
+      </w:pPr>
+      <w:r>
+        <w:drawing>
+          <wp:inline xmlns:a="http://schemas.openxmlformats.org/drawingml/2006/main" xmlns:pic="http://schemas.openxmlformats.org/drawingml/2006/picture">
+            <wp:extent cx="5394960" cy="1065355"/>
+            <wp:docPr id="2" name="Picture 2"/>
+            <wp:cNvGraphicFramePr>
+              <a:graphicFrameLocks noChangeAspect="1"/>
+            </wp:cNvGraphicFramePr>
+            <a:graphic>
+              <a:graphicData uri="http://schemas.openxmlformats.org/drawingml/2006/picture">
+                <pic:pic>
+                  <pic:nvPicPr>
+                    <pic:cNvPr id="0" name="eq_ordering.png"/>
+                    <pic:cNvPicPr/>
+                  </pic:nvPicPr>
+                  <pic:blipFill>
+                    <a:blip r:embed="rId10"/>
+                    <a:stretch>
+                      <a:fillRect/>
+                    </a:stretch>
+                  </pic:blipFill>
+                  <pic:spPr>
+                    <a:xfrm>
+                      <a:off x="0" y="0"/>
+                      <a:ext cx="5394960" cy="1065355"/>
+                    </a:xfrm>
+                    <a:prstGeom prst="rect"/>
+                  </pic:spPr>
+                </pic:pic>
+              </a:graphicData>
+            </a:graphic>
+          </wp:inline>
+        </w:drawing>
+      </w:r>
+    </w:p>
+    <w:p>
+      <w:pPr>
+        <w:jc w:val="center"/>
+      </w:pPr>
+      <w:r>
+        <w:rPr>
+          <w:i/>
+          <w:sz w:val="20"/>
+        </w:rPr>
+        <w:t>Equation 1. Validate → receipt → execute on the golden path.</w:t>
+      </w:r>
+    </w:p>
+    <w:p>
+      <w:pPr>
+        <w:jc w:val="center"/>
+      </w:pPr>
+      <w:r>
+        <w:drawing>
+          <wp:inline xmlns:a="http://schemas.openxmlformats.org/drawingml/2006/main" xmlns:pic="http://schemas.openxmlformats.org/drawingml/2006/picture">
+            <wp:extent cx="5394960" cy="1460813"/>
+            <wp:docPr id="3" name="Picture 3"/>
+            <wp:cNvGraphicFramePr>
+              <a:graphicFrameLocks noChangeAspect="1"/>
+            </wp:cNvGraphicFramePr>
+            <a:graphic>
+              <a:graphicData uri="http://schemas.openxmlformats.org/drawingml/2006/picture">
+                <pic:pic>
+                  <pic:nvPicPr>
+                    <pic:cNvPr id="0" name="eq_allow_ledger.png"/>
+                    <pic:cNvPicPr/>
+                  </pic:nvPicPr>
+                  <pic:blipFill>
+                    <a:blip r:embed="rId11"/>
+                    <a:stretch>
+                      <a:fillRect/>
+                    </a:stretch>
+                  </pic:blipFill>
+                  <pic:spPr>
+                    <a:xfrm>
+                      <a:off x="0" y="0"/>
+                      <a:ext cx="5394960" cy="1460813"/>
+                    </a:xfrm>
+                    <a:prstGeom prst="rect"/>
+                  </pic:spPr>
+                </pic:pic>
+              </a:graphicData>
+            </a:graphic>
+          </wp:inline>
+        </w:drawing>
+      </w:r>
+    </w:p>
+    <w:p>
+      <w:pPr>
+        <w:jc w:val="center"/>
+      </w:pPr>
+      <w:r>
+        <w:rPr>
+          <w:i/>
+          <w:sz w:val="20"/>
+        </w:rPr>
+        <w:t>Equation 2. Allow requires durable ledger evidence (else deny).</w:t>
+      </w:r>
+    </w:p>
+    <w:p>
+      <w:r>
+        <w:rPr>
+          <w:b/>
+        </w:rPr>
+        <w:t>Formal methods (not shown as images):</w:t>
+      </w:r>
+      <w:r>
+        <w:t xml:space="preserve"> `formal/tla/are_execution_boundary.tla` is a </w:t>
+      </w:r>
+      <w:r>
+        <w:rPr>
+          <w:b/>
+        </w:rPr>
+        <w:t>TLA+ skeleton</w:t>
+      </w:r>
+      <w:r>
+        <w:t xml:space="preserve"> — a </w:t>
+      </w:r>
+      <w:r>
+        <w:rPr>
+          <w:b/>
+        </w:rPr>
+        <w:t>proof target</w:t>
+      </w:r>
+      <w:r>
+        <w:t>, not a TLAPS proof.</w:t>
+      </w:r>
+    </w:p>
+    <w:p>
+      <w:pPr>
+        <w:jc w:val="center"/>
+      </w:pPr>
+      <w:r>
         <w:rPr>
           <w:b/>
           <w:sz w:val="32"/>
@@ -3002,38 +3347,59 @@
       </w:r>
     </w:p>
     <w:p>
-      <w:r>
-        <w:t>1. Leveson, N.G. *Engineering a Safer World: Systems Thinking Applied to Safety.* MIT Press, 2012.</w:t>
+      <w:pPr>
+        <w:pStyle w:val="ListNumber"/>
+      </w:pPr>
+      <w:r>
+        <w:t>Leveson, N.G. *Engineering a Safer World: Systems Thinking Applied to Safety.* MIT Press, 2012.</w:t>
       </w:r>
     </w:p>
     <w:p>
-      <w:r>
-        <w:t>2. Leveson, N.G. and Thomas, J.P. *STPA Handbook.* MIT, 2018.</w:t>
+      <w:pPr>
+        <w:pStyle w:val="ListNumber"/>
+      </w:pPr>
+      <w:r>
+        <w:t>Leveson, N.G. and Thomas, J.P. *STPA Handbook.* MIT, 2018.</w:t>
       </w:r>
     </w:p>
     <w:p>
-      <w:r>
-        <w:t>3. Saltzer, J.H., Reed, D.P. and Clark, D.D. End-to-End Arguments in System Design. *ACM TOCS*, 2(4):277–288, 1984.</w:t>
+      <w:pPr>
+        <w:pStyle w:val="ListNumber"/>
+      </w:pPr>
+      <w:r>
+        <w:t>Saltzer, J.H., Reed, D.P. and Clark, D.D. End-to-End Arguments in System Design. *ACM TOCS*, 2(4):277–288, 1984.</w:t>
       </w:r>
     </w:p>
     <w:p>
-      <w:r>
-        <w:t>4. Schneider, F.B. Enforceable Security Policies. *ACM TISSEC*, 3(1):30–50, 2000.</w:t>
+      <w:pPr>
+        <w:pStyle w:val="ListNumber"/>
+      </w:pPr>
+      <w:r>
+        <w:t>Schneider, F.B. Enforceable Security Policies. *ACM TISSEC*, 3(1):30–50, 2000.</w:t>
       </w:r>
     </w:p>
     <w:p>
-      <w:r>
-        <w:t>5. Lamport, L. *Specifying Systems: The TLA+ Language and Tools.* Addison-Wesley, 2002.</w:t>
+      <w:pPr>
+        <w:pStyle w:val="ListNumber"/>
+      </w:pPr>
+      <w:r>
+        <w:t>Lamport, L. *Specifying Systems: The TLA+ Language and Tools.* Addison-Wesley, 2002.</w:t>
       </w:r>
     </w:p>
     <w:p>
-      <w:r>
-        <w:t>6. NIST. *Artificial Intelligence Risk Management Framework (AI RMF 1.0).* NIST AI 100-1, 2023.</w:t>
+      <w:pPr>
+        <w:pStyle w:val="ListNumber"/>
+      </w:pPr>
+      <w:r>
+        <w:t>NIST. *Artificial Intelligence Risk Management Framework (AI RMF 1.0).* NIST AI 100-1, 2023.</w:t>
       </w:r>
     </w:p>
     <w:p>
-      <w:r>
-        <w:t xml:space="preserve">7. Agent Responsibility Engineering — public discipline repo (README, PDFs): [github.com/srex-dev/AgentResponsibilityEngineering](https://github.com/srex-dev/AgentResponsibilityEngineering). </w:t>
+      <w:pPr>
+        <w:pStyle w:val="ListNumber"/>
+      </w:pPr>
+      <w:r>
+        <w:t xml:space="preserve">Agent Responsibility Engineering — public discipline repo (README, PDFs): [github.com/srex-dev/AgentResponsibilityEngineering](https://github.com/srex-dev/AgentResponsibilityEngineering). </w:t>
       </w:r>
       <w:r>
         <w:rPr>
@@ -3055,8 +3421,11 @@
       </w:r>
     </w:p>
     <w:p>
-      <w:r>
-        <w:t>8. Normative STPA closure and evidence spine (this repository): `research/stpa/README.md`, `research/stpa/STPA_RESOLUTION.md`, `research/stpa/STPA_PACKAGE.md`, `research/stpa/UCA_ENUMERATION.md`, `research/interposition_audit.md`, `research/evidence-bundles/README.md`.</w:t>
+      <w:pPr>
+        <w:pStyle w:val="ListNumber"/>
+      </w:pPr>
+      <w:r>
+        <w:t>Normative STPA closure and evidence spine (this repository): `research/stpa/README.md`, `research/stpa/STPA_RESOLUTION.md`, `research/stpa/STPA_PACKAGE.md`, `research/stpa/UCA_ENUMERATION.md`, `research/interposition_audit.md`, `research/evidence-bundles/README.md`.</w:t>
       </w:r>
     </w:p>
     <w:p>
@@ -3583,176 +3952,63 @@
         <w:pStyle w:val="Heading1"/>
       </w:pPr>
       <w:r>
-        <w:t>Appendix C. Figure (text): golden governed execution chain</w:t>
+        <w:t>Appendix C. Figure (graphic): golden governed execution chain</w:t>
       </w:r>
     </w:p>
     <w:p>
       <w:r>
-        <w:t xml:space="preserve">Single-chain causal order asserted for </w:t>
-      </w:r>
-      <w:r>
-        <w:rPr>
-          <w:b/>
-        </w:rPr>
-        <w:t>verified</w:t>
-      </w:r>
-      <w:r>
-        <w:t xml:space="preserve"> claims (see §3.5, §4, frozen tests):</w:t>
+        <w:t>*Graphic also shown in §13.4. Deployment routing and side channels remain explicit assumptions in `STPA_RESOLUTION.md`.*</w:t>
       </w:r>
     </w:p>
     <w:p>
-      <w:r>
-        <w:t xml:space="preserve">    proposed action</w:t>
-      </w:r>
-    </w:p>
-    <w:tbl>
-      <w:tblPr>
-        <w:tblStyle w:val="TableGrid"/>
-        <w:tblW w:type="auto" w:w="0"/>
-        <w:tblLook w:firstColumn="1" w:firstRow="1" w:lastColumn="0" w:lastRow="0" w:noHBand="0" w:noVBand="1" w:val="04A0"/>
-      </w:tblPr>
-      <w:tblGrid>
-        <w:gridCol w:w="8640"/>
-      </w:tblGrid>
-      <w:tr>
-        <w:tc>
-          <w:tcPr>
-            <w:tcW w:type="dxa" w:w="8640"/>
-          </w:tcPr>
-          <w:p>
-            <w:r>
-              <w:rPr>
-                <w:b/>
-              </w:rPr>
-            </w:r>
-          </w:p>
-        </w:tc>
-      </w:tr>
-    </w:tbl>
-    <w:p>
-      <w:r>
-        <w:t xml:space="preserve">    policy coprocessor  (verdict; Allow requires Ledger write — H6)</w:t>
-      </w:r>
-    </w:p>
-    <w:tbl>
-      <w:tblPr>
-        <w:tblStyle w:val="TableGrid"/>
-        <w:tblW w:type="auto" w:w="0"/>
-        <w:tblLook w:firstColumn="1" w:firstRow="1" w:lastColumn="0" w:lastRow="0" w:noHBand="0" w:noVBand="1" w:val="04A0"/>
-      </w:tblPr>
-      <w:tblGrid>
-        <w:gridCol w:w="8640"/>
-      </w:tblGrid>
-      <w:tr>
-        <w:tc>
-          <w:tcPr>
-            <w:tcW w:type="dxa" w:w="8640"/>
-          </w:tcPr>
-          <w:p>
-            <w:r>
-              <w:rPr>
-                <w:b/>
-              </w:rPr>
-            </w:r>
-          </w:p>
-        </w:tc>
-      </w:tr>
-    </w:tbl>
-    <w:p>
-      <w:r>
-        <w:t xml:space="preserve">    pre-execution validator  (live passport / binding)</w:t>
-      </w:r>
-    </w:p>
-    <w:tbl>
-      <w:tblPr>
-        <w:tblStyle w:val="TableGrid"/>
-        <w:tblW w:type="auto" w:w="0"/>
-        <w:tblLook w:firstColumn="1" w:firstRow="1" w:lastColumn="0" w:lastRow="0" w:noHBand="0" w:noVBand="1" w:val="04A0"/>
-      </w:tblPr>
-      <w:tblGrid>
-        <w:gridCol w:w="8640"/>
-      </w:tblGrid>
-      <w:tr>
-        <w:tc>
-          <w:tcPr>
-            <w:tcW w:type="dxa" w:w="8640"/>
-          </w:tcPr>
-          <w:p>
-            <w:r>
-              <w:rPr>
-                <w:b/>
-              </w:rPr>
-            </w:r>
-          </w:p>
-        </w:tc>
-      </w:tr>
-    </w:tbl>
-    <w:p>
-      <w:r>
-        <w:t xml:space="preserve">    receipt generator  (evidence binding)</w:t>
-      </w:r>
-    </w:p>
-    <w:tbl>
-      <w:tblPr>
-        <w:tblStyle w:val="TableGrid"/>
-        <w:tblW w:type="auto" w:w="0"/>
-        <w:tblLook w:firstColumn="1" w:firstRow="1" w:lastColumn="0" w:lastRow="0" w:noHBand="0" w:noVBand="1" w:val="04A0"/>
-      </w:tblPr>
-      <w:tblGrid>
-        <w:gridCol w:w="8640"/>
-      </w:tblGrid>
-      <w:tr>
-        <w:tc>
-          <w:tcPr>
-            <w:tcW w:type="dxa" w:w="8640"/>
-          </w:tcPr>
-          <w:p>
-            <w:r>
-              <w:rPr>
-                <w:b/>
-              </w:rPr>
-            </w:r>
-          </w:p>
-        </w:tc>
-      </w:tr>
-    </w:tbl>
-    <w:p>
-      <w:r>
-        <w:t xml:space="preserve">    atomic execution engine  (validate → receipt → execute)</w:t>
-      </w:r>
-    </w:p>
-    <w:tbl>
-      <w:tblPr>
-        <w:tblStyle w:val="TableGrid"/>
-        <w:tblW w:type="auto" w:w="0"/>
-        <w:tblLook w:firstColumn="1" w:firstRow="1" w:lastColumn="0" w:lastRow="0" w:noHBand="0" w:noVBand="1" w:val="04A0"/>
-      </w:tblPr>
-      <w:tblGrid>
-        <w:gridCol w:w="8640"/>
-      </w:tblGrid>
-      <w:tr>
-        <w:tc>
-          <w:tcPr>
-            <w:tcW w:type="dxa" w:w="8640"/>
-          </w:tcPr>
-          <w:p>
-            <w:r>
-              <w:rPr>
-                <w:b/>
-              </w:rPr>
-            </w:r>
-          </w:p>
-        </w:tc>
-      </w:tr>
-    </w:tbl>
-    <w:p>
-      <w:r>
-        <w:t xml:space="preserve">    executor  (side effect)</w:t>
+      <w:pPr>
+        <w:jc w:val="center"/>
+      </w:pPr>
+      <w:r>
+        <w:drawing>
+          <wp:inline xmlns:a="http://schemas.openxmlformats.org/drawingml/2006/main" xmlns:pic="http://schemas.openxmlformats.org/drawingml/2006/picture">
+            <wp:extent cx="5394960" cy="1181886"/>
+            <wp:docPr id="4" name="Picture 4"/>
+            <wp:cNvGraphicFramePr>
+              <a:graphicFrameLocks noChangeAspect="1"/>
+            </wp:cNvGraphicFramePr>
+            <a:graphic>
+              <a:graphicData uri="http://schemas.openxmlformats.org/drawingml/2006/picture">
+                <pic:pic>
+                  <pic:nvPicPr>
+                    <pic:cNvPr id="0" name="fig_golden_path.png"/>
+                    <pic:cNvPicPr/>
+                  </pic:nvPicPr>
+                  <pic:blipFill>
+                    <a:blip r:embed="rId9"/>
+                    <a:stretch>
+                      <a:fillRect/>
+                    </a:stretch>
+                  </pic:blipFill>
+                  <pic:spPr>
+                    <a:xfrm>
+                      <a:off x="0" y="0"/>
+                      <a:ext cx="5394960" cy="1181886"/>
+                    </a:xfrm>
+                    <a:prstGeom prst="rect"/>
+                  </pic:spPr>
+                </pic:pic>
+              </a:graphicData>
+            </a:graphic>
+          </wp:inline>
+        </w:drawing>
       </w:r>
     </w:p>
     <w:p>
-      <w:r>
-        <w:t>*Not a circuit diagram; deployment routing and side channels are explicit assumptions in `STPA_RESOLUTION.md`.*</w:t>
+      <w:pPr>
+        <w:jc w:val="center"/>
+      </w:pPr>
+      <w:r>
+        <w:rPr>
+          <w:i/>
+          <w:sz w:val="20"/>
+        </w:rPr>
+        <w:t>Figure C-1. Governed execution chain (graphic summary).</w:t>
       </w:r>
     </w:p>
     <w:p>

</xml_diff>